<commit_message>
feat(workshop): fiches d'intervention & entretien systematique avec signatures tablettes
- Fiche 1 Intervention: panne signalee, diagnostic par compartiment, pieces a commander, temps d'intervention

- Fiche 2 Entretien: matrice 17 controles par palier 5k/10k/30k/50k/100k km

- Modal tablette tactile + signatures Canvas (client, technicien, responsable)

- Routes d'impression A4 dediees /workshop/[id]/fiche-*

- Schema Prisma: WorkshopChecklistItem + WorkshopSignature (tables deja synchronisees sur Neon)

- Documentation PASSATION_COMPLETE.md + renvoi README
</commit_message>
<xml_diff>
--- a/docs/CONTRAT_CADRE_CARZONE_SARL_AVEC_LOGO.docx
+++ b/docs/CONTRAT_CADRE_CARZONE_SARL_AVEC_LOGO.docx
@@ -239,7 +239,25 @@
                 <w:color w:val="0F172A"/>
                 <w:sz w:val="19"/>
               </w:rPr>
-              <w:t>21 Octobre 2026</w:t>
+              <w:t xml:space="preserve">21 </w:t>
+            </w:r>
+            <w:proofErr w:type="spellStart"/>
+            <w:r>
+              <w:rPr>
+                <w:b/>
+                <w:color w:val="0F172A"/>
+                <w:sz w:val="19"/>
+              </w:rPr>
+              <w:t>Octobre</w:t>
+            </w:r>
+            <w:proofErr w:type="spellEnd"/>
+            <w:r>
+              <w:rPr>
+                <w:b/>
+                <w:color w:val="0F172A"/>
+                <w:sz w:val="19"/>
+              </w:rPr>
+              <w:t xml:space="preserve"> 2026</w:t>
             </w:r>
           </w:p>
         </w:tc>
@@ -287,7 +305,25 @@
                 <w:color w:val="0F172A"/>
                 <w:sz w:val="19"/>
               </w:rPr>
-              <w:t>Cotonou (Bénin)</w:t>
+              <w:t>Cotonou (</w:t>
+            </w:r>
+            <w:proofErr w:type="spellStart"/>
+            <w:r>
+              <w:rPr>
+                <w:b/>
+                <w:color w:val="0F172A"/>
+                <w:sz w:val="19"/>
+              </w:rPr>
+              <w:t>Bénin</w:t>
+            </w:r>
+            <w:proofErr w:type="spellEnd"/>
+            <w:r>
+              <w:rPr>
+                <w:b/>
+                <w:color w:val="0F172A"/>
+                <w:sz w:val="19"/>
+              </w:rPr>
+              <w:t>)</w:t>
             </w:r>
           </w:p>
         </w:tc>
@@ -1319,16 +1355,7 @@
                 <w:sz w:val="26"/>
                 <w:lang w:val="fr-FR"/>
               </w:rPr>
-              <w:t>1</w:t>
-            </w:r>
-            <w:r>
-              <w:rPr>
-                <w:b/>
-                <w:color w:val="D97706"/>
-                <w:sz w:val="26"/>
-                <w:lang w:val="fr-FR"/>
-              </w:rPr>
-              <w:t xml:space="preserve"> </w:t>
+              <w:t>00</w:t>
             </w:r>
             <w:r>
               <w:rPr>
@@ -1474,15 +1501,74 @@
                 <w:sz w:val="17"/>
                 <w:lang w:val="fr-FR"/>
               </w:rPr>
-              <w:t xml:space="preserve">Échéancier en 3 tranches : </w:t>
-            </w:r>
-            <w:r>
-              <w:rPr>
+              <w:t xml:space="preserve">Échéancier en 3 tranches </w:t>
+            </w:r>
+            <w:r>
+              <w:rPr>
+                <w:b/>
+                <w:color w:val="0F172A"/>
+                <w:sz w:val="17"/>
+                <w:lang w:val="fr-FR"/>
+              </w:rPr>
+              <w:t xml:space="preserve">: </w:t>
+            </w:r>
+            <w:r>
+              <w:rPr>
+                <w:b/>
+                <w:color w:val="0F172A"/>
+                <w:sz w:val="17"/>
+                <w:lang w:val="fr-FR"/>
+              </w:rPr>
+              <w:t>4</w:t>
+            </w:r>
+            <w:r>
+              <w:rPr>
+                <w:b/>
                 <w:color w:val="475569"/>
                 <w:sz w:val="17"/>
                 <w:lang w:val="fr-FR"/>
               </w:rPr>
-              <w:t>50% à la commande, 30% à la mise en ligne, 20% à la recette finale.</w:t>
+              <w:t>0%</w:t>
+            </w:r>
+            <w:r>
+              <w:rPr>
+                <w:color w:val="475569"/>
+                <w:sz w:val="17"/>
+                <w:lang w:val="fr-FR"/>
+              </w:rPr>
+              <w:t xml:space="preserve"> à la commande, </w:t>
+            </w:r>
+            <w:r>
+              <w:rPr>
+                <w:color w:val="475569"/>
+                <w:sz w:val="17"/>
+                <w:lang w:val="fr-FR"/>
+              </w:rPr>
+              <w:t>4</w:t>
+            </w:r>
+            <w:r>
+              <w:rPr>
+                <w:color w:val="475569"/>
+                <w:sz w:val="17"/>
+                <w:lang w:val="fr-FR"/>
+              </w:rPr>
+              <w:t xml:space="preserve">0% à la mise en ligne, </w:t>
+            </w:r>
+            <w:r>
+              <w:rPr>
+                <w:color w:val="475569"/>
+                <w:sz w:val="17"/>
+                <w:lang w:val="fr-FR"/>
+              </w:rPr>
+              <w:t>2</w:t>
+            </w:r>
+            <w:r>
+              <w:rPr>
+                <w:color w:val="475569"/>
+                <w:sz w:val="17"/>
+                <w:lang w:val="fr-FR"/>
+              </w:rPr>
+              <w:t>0% à la recette finale.</w:t>
             </w:r>
           </w:p>
           <w:p>
@@ -1668,7 +1754,7 @@
                 <w:sz w:val="16"/>
                 <w:lang w:val="fr-FR"/>
               </w:rPr>
-              <w:t>1</w:t>
+              <w:t>0</w:t>
             </w:r>
             <w:r>
               <w:rPr>
@@ -1909,8 +1995,36 @@
                 <w:color w:val="FFFFFF"/>
                 <w:sz w:val="17"/>
               </w:rPr>
-              <w:t>Option 1 : SaaS Intégral</w:t>
-            </w:r>
+              <w:t xml:space="preserve">Option </w:t>
+            </w:r>
+            <w:proofErr w:type="gramStart"/>
+            <w:r>
+              <w:rPr>
+                <w:b/>
+                <w:color w:val="FFFFFF"/>
+                <w:sz w:val="17"/>
+              </w:rPr>
+              <w:t>1 :</w:t>
+            </w:r>
+            <w:proofErr w:type="gramEnd"/>
+            <w:r>
+              <w:rPr>
+                <w:b/>
+                <w:color w:val="FFFFFF"/>
+                <w:sz w:val="17"/>
+              </w:rPr>
+              <w:t xml:space="preserve"> SaaS </w:t>
+            </w:r>
+            <w:proofErr w:type="spellStart"/>
+            <w:r>
+              <w:rPr>
+                <w:b/>
+                <w:color w:val="FFFFFF"/>
+                <w:sz w:val="17"/>
+              </w:rPr>
+              <w:t>Intégral</w:t>
+            </w:r>
+            <w:proofErr w:type="spellEnd"/>
           </w:p>
         </w:tc>
         <w:tc>
@@ -1931,8 +2045,54 @@
                 <w:color w:val="FFFFFF"/>
                 <w:sz w:val="17"/>
               </w:rPr>
-              <w:t>Option 2 : Achat Licence</w:t>
-            </w:r>
+              <w:t xml:space="preserve">Option </w:t>
+            </w:r>
+            <w:proofErr w:type="gramStart"/>
+            <w:r>
+              <w:rPr>
+                <w:b/>
+                <w:color w:val="FFFFFF"/>
+                <w:sz w:val="17"/>
+              </w:rPr>
+              <w:t>2 :</w:t>
+            </w:r>
+            <w:proofErr w:type="gramEnd"/>
+            <w:r>
+              <w:rPr>
+                <w:b/>
+                <w:color w:val="FFFFFF"/>
+                <w:sz w:val="17"/>
+              </w:rPr>
+              <w:t xml:space="preserve"> </w:t>
+            </w:r>
+            <w:proofErr w:type="spellStart"/>
+            <w:r>
+              <w:rPr>
+                <w:b/>
+                <w:color w:val="FFFFFF"/>
+                <w:sz w:val="17"/>
+              </w:rPr>
+              <w:t>Achat</w:t>
+            </w:r>
+            <w:proofErr w:type="spellEnd"/>
+            <w:r>
+              <w:rPr>
+                <w:b/>
+                <w:color w:val="FFFFFF"/>
+                <w:sz w:val="17"/>
+              </w:rPr>
+              <w:t xml:space="preserve"> </w:t>
+            </w:r>
+            <w:proofErr w:type="spellStart"/>
+            <w:r>
+              <w:rPr>
+                <w:b/>
+                <w:color w:val="FFFFFF"/>
+                <w:sz w:val="17"/>
+              </w:rPr>
+              <w:t>Licence</w:t>
+            </w:r>
+            <w:proofErr w:type="spellEnd"/>
           </w:p>
         </w:tc>
         <w:tc>
@@ -1947,13 +2107,23 @@
             </w:tcMar>
           </w:tcPr>
           <w:p>
+            <w:proofErr w:type="spellStart"/>
             <w:r>
               <w:rPr>
                 <w:b/>
                 <w:color w:val="FFFFFF"/>
                 <w:sz w:val="17"/>
               </w:rPr>
-              <w:t>Règle Applicable CARZONE</w:t>
+              <w:t>Règle</w:t>
+            </w:r>
+            <w:proofErr w:type="spellEnd"/>
+            <w:r>
+              <w:rPr>
+                <w:b/>
+                <w:color w:val="FFFFFF"/>
+                <w:sz w:val="17"/>
+              </w:rPr>
+              <w:t xml:space="preserve"> Applicable CARZONE</w:t>
             </w:r>
           </w:p>
         </w:tc>
@@ -1983,13 +2153,23 @@
             <w:pPr>
               <w:spacing w:after="0"/>
             </w:pPr>
+            <w:proofErr w:type="spellStart"/>
             <w:r>
               <w:rPr>
                 <w:b/>
                 <w:color w:val="0F172A"/>
                 <w:sz w:val="17"/>
               </w:rPr>
-              <w:t>Investissement Initial (Setup)</w:t>
+              <w:t>Investissement</w:t>
+            </w:r>
+            <w:proofErr w:type="spellEnd"/>
+            <w:r>
+              <w:rPr>
+                <w:b/>
+                <w:color w:val="0F172A"/>
+                <w:sz w:val="17"/>
+              </w:rPr>
+              <w:t xml:space="preserve"> Initial (Setup)</w:t>
             </w:r>
           </w:p>
         </w:tc>
@@ -2020,7 +2200,43 @@
                 <w:color w:val="10B981"/>
                 <w:sz w:val="17"/>
               </w:rPr>
-              <w:t>0 FCFA (Démarrage immédiat)</w:t>
+              <w:t>0 FCFA (</w:t>
+            </w:r>
+            <w:proofErr w:type="spellStart"/>
+            <w:r>
+              <w:rPr>
+                <w:b/>
+                <w:color w:val="10B981"/>
+                <w:sz w:val="17"/>
+              </w:rPr>
+              <w:t>Démarrage</w:t>
+            </w:r>
+            <w:proofErr w:type="spellEnd"/>
+            <w:r>
+              <w:rPr>
+                <w:b/>
+                <w:color w:val="10B981"/>
+                <w:sz w:val="17"/>
+              </w:rPr>
+              <w:t xml:space="preserve"> </w:t>
+            </w:r>
+            <w:proofErr w:type="spellStart"/>
+            <w:r>
+              <w:rPr>
+                <w:b/>
+                <w:color w:val="10B981"/>
+                <w:sz w:val="17"/>
+              </w:rPr>
+              <w:t>immédiat</w:t>
+            </w:r>
+            <w:proofErr w:type="spellEnd"/>
+            <w:r>
+              <w:rPr>
+                <w:b/>
+                <w:color w:val="10B981"/>
+                <w:sz w:val="17"/>
+              </w:rPr>
+              <w:t>)</w:t>
             </w:r>
           </w:p>
         </w:tc>
@@ -2055,7 +2271,7 @@
               <w:rPr>
                 <w:sz w:val="17"/>
               </w:rPr>
-              <w:t>1</w:t>
+              <w:t>0</w:t>
             </w:r>
             <w:r>
               <w:rPr>
@@ -2229,8 +2445,18 @@
                 <w:color w:val="10B981"/>
                 <w:sz w:val="17"/>
               </w:rPr>
-              <w:t>5 000 FCFA / mois</w:t>
-            </w:r>
+              <w:t xml:space="preserve">5 000 FCFA / </w:t>
+            </w:r>
+            <w:proofErr w:type="spellStart"/>
+            <w:r>
+              <w:rPr>
+                <w:b/>
+                <w:color w:val="10B981"/>
+                <w:sz w:val="17"/>
+              </w:rPr>
+              <w:t>mois</w:t>
+            </w:r>
+            <w:proofErr w:type="spellEnd"/>
           </w:p>
         </w:tc>
         <w:tc>
@@ -2260,8 +2486,18 @@
                 <w:color w:val="10B981"/>
                 <w:sz w:val="17"/>
               </w:rPr>
-              <w:t>65 000 FCFA / mois</w:t>
-            </w:r>
+              <w:t xml:space="preserve">65 000 FCFA / </w:t>
+            </w:r>
+            <w:proofErr w:type="spellStart"/>
+            <w:r>
+              <w:rPr>
+                <w:b/>
+                <w:color w:val="10B981"/>
+                <w:sz w:val="17"/>
+              </w:rPr>
+              <w:t>mois</w:t>
+            </w:r>
+            <w:proofErr w:type="spellEnd"/>
           </w:p>
         </w:tc>
         <w:tc>
@@ -2504,7 +2740,25 @@
                 <w:color w:val="0F172A"/>
                 <w:sz w:val="17"/>
               </w:rPr>
-              <w:t>Support Direct WhatsApp &amp; Tél. 6j/7</w:t>
+              <w:t xml:space="preserve">Support Direct WhatsApp &amp; </w:t>
+            </w:r>
+            <w:proofErr w:type="spellStart"/>
+            <w:r>
+              <w:rPr>
+                <w:b/>
+                <w:color w:val="0F172A"/>
+                <w:sz w:val="17"/>
+              </w:rPr>
+              <w:t>Tél</w:t>
+            </w:r>
+            <w:proofErr w:type="spellEnd"/>
+            <w:r>
+              <w:rPr>
+                <w:b/>
+                <w:color w:val="0F172A"/>
+                <w:sz w:val="17"/>
+              </w:rPr>
+              <w:t>. 6j/7</w:t>
             </w:r>
           </w:p>
         </w:tc>
@@ -2562,7 +2816,21 @@
               <w:rPr>
                 <w:sz w:val="17"/>
               </w:rPr>
-              <w:t>INCLUS (Pannes &amp; Incidents)</w:t>
+              <w:t>INCLUS (</w:t>
+            </w:r>
+            <w:proofErr w:type="spellStart"/>
+            <w:r>
+              <w:rPr>
+                <w:sz w:val="17"/>
+              </w:rPr>
+              <w:t>Pannes</w:t>
+            </w:r>
+            <w:proofErr w:type="spellEnd"/>
+            <w:r>
+              <w:rPr>
+                <w:sz w:val="17"/>
+              </w:rPr>
+              <w:t xml:space="preserve"> &amp; Incidents)</w:t>
             </w:r>
           </w:p>
         </w:tc>
@@ -2676,11 +2944,33 @@
             <w:pPr>
               <w:spacing w:after="0"/>
             </w:pPr>
-            <w:r>
-              <w:rPr>
-                <w:sz w:val="17"/>
-              </w:rPr>
-              <w:t>Inclus (Serveur Next.js &amp; Neon)</w:t>
+            <w:proofErr w:type="spellStart"/>
+            <w:r>
+              <w:rPr>
+                <w:sz w:val="17"/>
+              </w:rPr>
+              <w:t>Inclus</w:t>
+            </w:r>
+            <w:proofErr w:type="spellEnd"/>
+            <w:r>
+              <w:rPr>
+                <w:sz w:val="17"/>
+              </w:rPr>
+              <w:t xml:space="preserve"> (</w:t>
+            </w:r>
+            <w:proofErr w:type="spellStart"/>
+            <w:r>
+              <w:rPr>
+                <w:sz w:val="17"/>
+              </w:rPr>
+              <w:t>Serveur</w:t>
+            </w:r>
+            <w:proofErr w:type="spellEnd"/>
+            <w:r>
+              <w:rPr>
+                <w:sz w:val="17"/>
+              </w:rPr>
+              <w:t xml:space="preserve"> Next.js &amp; Neon)</w:t>
             </w:r>
           </w:p>
         </w:tc>
@@ -2705,11 +2995,33 @@
             <w:pPr>
               <w:spacing w:after="0"/>
             </w:pPr>
-            <w:r>
-              <w:rPr>
-                <w:sz w:val="17"/>
-              </w:rPr>
-              <w:t>Inclus (Cloud sécurisé HTTPS)</w:t>
+            <w:proofErr w:type="spellStart"/>
+            <w:r>
+              <w:rPr>
+                <w:sz w:val="17"/>
+              </w:rPr>
+              <w:t>Inclus</w:t>
+            </w:r>
+            <w:proofErr w:type="spellEnd"/>
+            <w:r>
+              <w:rPr>
+                <w:sz w:val="17"/>
+              </w:rPr>
+              <w:t xml:space="preserve"> (Cloud </w:t>
+            </w:r>
+            <w:proofErr w:type="spellStart"/>
+            <w:r>
+              <w:rPr>
+                <w:sz w:val="17"/>
+              </w:rPr>
+              <w:t>sécurisé</w:t>
+            </w:r>
+            <w:proofErr w:type="spellEnd"/>
+            <w:r>
+              <w:rPr>
+                <w:sz w:val="17"/>
+              </w:rPr>
+              <w:t xml:space="preserve"> HTTPS)</w:t>
             </w:r>
           </w:p>
         </w:tc>
@@ -2817,8 +3129,58 @@
               <w:rPr>
                 <w:sz w:val="17"/>
               </w:rPr>
-              <w:t>5 heures offertes chaque mois</w:t>
-            </w:r>
+              <w:t xml:space="preserve">5 </w:t>
+            </w:r>
+            <w:proofErr w:type="spellStart"/>
+            <w:r>
+              <w:rPr>
+                <w:sz w:val="17"/>
+              </w:rPr>
+              <w:t>heures</w:t>
+            </w:r>
+            <w:proofErr w:type="spellEnd"/>
+            <w:r>
+              <w:rPr>
+                <w:sz w:val="17"/>
+              </w:rPr>
+              <w:t xml:space="preserve"> </w:t>
+            </w:r>
+            <w:proofErr w:type="spellStart"/>
+            <w:r>
+              <w:rPr>
+                <w:sz w:val="17"/>
+              </w:rPr>
+              <w:t>offertes</w:t>
+            </w:r>
+            <w:proofErr w:type="spellEnd"/>
+            <w:r>
+              <w:rPr>
+                <w:sz w:val="17"/>
+              </w:rPr>
+              <w:t xml:space="preserve"> </w:t>
+            </w:r>
+            <w:proofErr w:type="spellStart"/>
+            <w:r>
+              <w:rPr>
+                <w:sz w:val="17"/>
+              </w:rPr>
+              <w:t>chaque</w:t>
+            </w:r>
+            <w:proofErr w:type="spellEnd"/>
+            <w:r>
+              <w:rPr>
+                <w:sz w:val="17"/>
+              </w:rPr>
+              <w:t xml:space="preserve"> </w:t>
+            </w:r>
+            <w:proofErr w:type="spellStart"/>
+            <w:r>
+              <w:rPr>
+                <w:sz w:val="17"/>
+              </w:rPr>
+              <w:t>mois</w:t>
+            </w:r>
+            <w:proofErr w:type="spellEnd"/>
           </w:p>
         </w:tc>
         <w:tc>
@@ -2986,8 +3348,30 @@
               <w:rPr>
                 <w:sz w:val="17"/>
               </w:rPr>
-              <w:t>Droit d'exploitation exclusif</w:t>
-            </w:r>
+              <w:t xml:space="preserve">Droit </w:t>
+            </w:r>
+            <w:proofErr w:type="spellStart"/>
+            <w:r>
+              <w:rPr>
+                <w:sz w:val="17"/>
+              </w:rPr>
+              <w:t>d'exploitation</w:t>
+            </w:r>
+            <w:proofErr w:type="spellEnd"/>
+            <w:r>
+              <w:rPr>
+                <w:sz w:val="17"/>
+              </w:rPr>
+              <w:t xml:space="preserve"> </w:t>
+            </w:r>
+            <w:proofErr w:type="spellStart"/>
+            <w:r>
+              <w:rPr>
+                <w:sz w:val="17"/>
+              </w:rPr>
+              <w:t>exclusif</w:t>
+            </w:r>
+            <w:proofErr w:type="spellEnd"/>
           </w:p>
         </w:tc>
         <w:tc>
@@ -3011,11 +3395,33 @@
             <w:pPr>
               <w:spacing w:after="0"/>
             </w:pPr>
-            <w:r>
-              <w:rPr>
-                <w:sz w:val="17"/>
-              </w:rPr>
-              <w:t>Licence perpétuelle propriétaire</w:t>
+            <w:proofErr w:type="spellStart"/>
+            <w:r>
+              <w:rPr>
+                <w:sz w:val="17"/>
+              </w:rPr>
+              <w:t>Licence</w:t>
+            </w:r>
+            <w:proofErr w:type="spellEnd"/>
+            <w:r>
+              <w:rPr>
+                <w:sz w:val="17"/>
+              </w:rPr>
+              <w:t xml:space="preserve"> </w:t>
+            </w:r>
+            <w:proofErr w:type="spellStart"/>
+            <w:r>
+              <w:rPr>
+                <w:sz w:val="17"/>
+              </w:rPr>
+              <w:t>perpétuelle</w:t>
+            </w:r>
+            <w:proofErr w:type="spellEnd"/>
+            <w:r>
+              <w:rPr>
+                <w:sz w:val="17"/>
+              </w:rPr>
+              <w:t xml:space="preserve"> propriétaire</w:t>
             </w:r>
           </w:p>
         </w:tc>
@@ -3509,7 +3915,35 @@
               <w:rPr>
                 <w:sz w:val="16"/>
               </w:rPr>
-              <w:t xml:space="preserve"> Showroom, Stock, Atelier SAV, Facturation e-MECeF, RH</w:t>
+              <w:t xml:space="preserve"> Showroom, Stock, Atelier SAV, </w:t>
+            </w:r>
+            <w:proofErr w:type="spellStart"/>
+            <w:r>
+              <w:rPr>
+                <w:sz w:val="16"/>
+              </w:rPr>
+              <w:t>Facturation</w:t>
+            </w:r>
+            <w:proofErr w:type="spellEnd"/>
+            <w:r>
+              <w:rPr>
+                <w:sz w:val="16"/>
+              </w:rPr>
+              <w:t xml:space="preserve"> e-</w:t>
+            </w:r>
+            <w:proofErr w:type="spellStart"/>
+            <w:r>
+              <w:rPr>
+                <w:sz w:val="16"/>
+              </w:rPr>
+              <w:t>MECeF</w:t>
+            </w:r>
+            <w:proofErr w:type="spellEnd"/>
+            <w:r>
+              <w:rPr>
+                <w:sz w:val="16"/>
+              </w:rPr>
+              <w:t>, RH</w:t>
             </w:r>
           </w:p>
         </w:tc>
@@ -3778,7 +4212,21 @@
               <w:rPr>
                 <w:sz w:val="16"/>
               </w:rPr>
-              <w:t>Maintenance Corrective Prioritaire (GTR &lt; 4h)</w:t>
+              <w:t xml:space="preserve">Maintenance Corrective </w:t>
+            </w:r>
+            <w:proofErr w:type="spellStart"/>
+            <w:r>
+              <w:rPr>
+                <w:sz w:val="16"/>
+              </w:rPr>
+              <w:t>Prioritaire</w:t>
+            </w:r>
+            <w:proofErr w:type="spellEnd"/>
+            <w:r>
+              <w:rPr>
+                <w:sz w:val="16"/>
+              </w:rPr>
+              <w:t xml:space="preserve"> (GTR &lt; 4h)</w:t>
             </w:r>
           </w:p>
         </w:tc>
@@ -3842,15 +4290,7 @@
                 <w:color w:val="0284C7"/>
                 <w:sz w:val="16"/>
               </w:rPr>
-              <w:t>2</w:t>
-            </w:r>
-            <w:r>
-              <w:rPr>
-                <w:b/>
-                <w:color w:val="0284C7"/>
-                <w:sz w:val="16"/>
-              </w:rPr>
-              <w:t>5 000 FCFA</w:t>
+              <w:t>25 000 FCFA</w:t>
             </w:r>
           </w:p>
         </w:tc>
@@ -4241,11 +4681,47 @@
             <w:pPr>
               <w:spacing w:after="0"/>
             </w:pPr>
+            <w:proofErr w:type="spellStart"/>
             <w:r>
               <w:rPr>
                 <w:sz w:val="16"/>
               </w:rPr>
-              <w:t>Sauvegardes Quotidiennes &amp; Certificats SSL</w:t>
+              <w:t>Sauvegardes</w:t>
+            </w:r>
+            <w:proofErr w:type="spellEnd"/>
+            <w:r>
+              <w:rPr>
+                <w:sz w:val="16"/>
+              </w:rPr>
+              <w:t xml:space="preserve"> </w:t>
+            </w:r>
+            <w:proofErr w:type="spellStart"/>
+            <w:r>
+              <w:rPr>
+                <w:sz w:val="16"/>
+              </w:rPr>
+              <w:t>Quotidiennes</w:t>
+            </w:r>
+            <w:proofErr w:type="spellEnd"/>
+            <w:r>
+              <w:rPr>
+                <w:sz w:val="16"/>
+              </w:rPr>
+              <w:t xml:space="preserve"> &amp; </w:t>
+            </w:r>
+            <w:proofErr w:type="spellStart"/>
+            <w:r>
+              <w:rPr>
+                <w:sz w:val="16"/>
+              </w:rPr>
+              <w:t>Certificats</w:t>
+            </w:r>
+            <w:proofErr w:type="spellEnd"/>
+            <w:r>
+              <w:rPr>
+                <w:sz w:val="16"/>
+              </w:rPr>
+              <w:t xml:space="preserve"> SSL</w:t>
             </w:r>
           </w:p>
         </w:tc>
@@ -4461,8 +4937,16 @@
               <w:rPr>
                 <w:sz w:val="16"/>
               </w:rPr>
-              <w:t>Maintenance Corrective &amp; Support Dépannage</w:t>
-            </w:r>
+              <w:t xml:space="preserve">Maintenance Corrective &amp; Support </w:t>
+            </w:r>
+            <w:proofErr w:type="spellStart"/>
+            <w:r>
+              <w:rPr>
+                <w:sz w:val="16"/>
+              </w:rPr>
+              <w:t>Dépannage</w:t>
+            </w:r>
+            <w:proofErr w:type="spellEnd"/>
           </w:p>
         </w:tc>
         <w:tc>
@@ -4664,13 +5148,41 @@
             </w:tcMar>
           </w:tcPr>
           <w:p>
+            <w:proofErr w:type="spellStart"/>
             <w:r>
               <w:rPr>
                 <w:b/>
                 <w:color w:val="FFFFFF"/>
                 <w:sz w:val="17"/>
               </w:rPr>
-              <w:t>Exemple d'Incident Métier</w:t>
+              <w:t>Exemple</w:t>
+            </w:r>
+            <w:proofErr w:type="spellEnd"/>
+            <w:r>
+              <w:rPr>
+                <w:b/>
+                <w:color w:val="FFFFFF"/>
+                <w:sz w:val="17"/>
+              </w:rPr>
+              <w:t xml:space="preserve"> </w:t>
+            </w:r>
+            <w:proofErr w:type="spellStart"/>
+            <w:r>
+              <w:rPr>
+                <w:b/>
+                <w:color w:val="FFFFFF"/>
+                <w:sz w:val="17"/>
+              </w:rPr>
+              <w:t>d'Incident</w:t>
+            </w:r>
+            <w:proofErr w:type="spellEnd"/>
+            <w:r>
+              <w:rPr>
+                <w:b/>
+                <w:color w:val="FFFFFF"/>
+                <w:sz w:val="17"/>
+              </w:rPr>
+              <w:t xml:space="preserve"> Métier</w:t>
             </w:r>
           </w:p>
         </w:tc>
@@ -4686,14 +5198,52 @@
             </w:tcMar>
           </w:tcPr>
           <w:p>
+            <w:proofErr w:type="spellStart"/>
             <w:r>
               <w:rPr>
                 <w:b/>
                 <w:color w:val="FFFFFF"/>
                 <w:sz w:val="17"/>
               </w:rPr>
-              <w:t>Prise en Compte</w:t>
-            </w:r>
+              <w:t>Prise</w:t>
+            </w:r>
+            <w:proofErr w:type="spellEnd"/>
+            <w:r>
+              <w:rPr>
+                <w:b/>
+                <w:color w:val="FFFFFF"/>
+                <w:sz w:val="17"/>
+              </w:rPr>
+              <w:t xml:space="preserve"> </w:t>
+            </w:r>
+            <w:proofErr w:type="spellStart"/>
+            <w:r>
+              <w:rPr>
+                <w:b/>
+                <w:color w:val="FFFFFF"/>
+                <w:sz w:val="17"/>
+              </w:rPr>
+              <w:t>en</w:t>
+            </w:r>
+            <w:proofErr w:type="spellEnd"/>
+            <w:r>
+              <w:rPr>
+                <w:b/>
+                <w:color w:val="FFFFFF"/>
+                <w:sz w:val="17"/>
+              </w:rPr>
+              <w:t xml:space="preserve"> </w:t>
+            </w:r>
+            <w:proofErr w:type="spellStart"/>
+            <w:r>
+              <w:rPr>
+                <w:b/>
+                <w:color w:val="FFFFFF"/>
+                <w:sz w:val="17"/>
+              </w:rPr>
+              <w:t>Compte</w:t>
+            </w:r>
+            <w:proofErr w:type="spellEnd"/>
           </w:p>
         </w:tc>
         <w:tc>
@@ -4708,14 +5258,34 @@
             </w:tcMar>
           </w:tcPr>
           <w:p>
+            <w:proofErr w:type="spellStart"/>
             <w:r>
               <w:rPr>
                 <w:b/>
                 <w:color w:val="FFFFFF"/>
                 <w:sz w:val="17"/>
               </w:rPr>
-              <w:t>Résolution Garantie</w:t>
-            </w:r>
+              <w:t>Résolution</w:t>
+            </w:r>
+            <w:proofErr w:type="spellEnd"/>
+            <w:r>
+              <w:rPr>
+                <w:b/>
+                <w:color w:val="FFFFFF"/>
+                <w:sz w:val="17"/>
+              </w:rPr>
+              <w:t xml:space="preserve"> </w:t>
+            </w:r>
+            <w:proofErr w:type="spellStart"/>
+            <w:r>
+              <w:rPr>
+                <w:b/>
+                <w:color w:val="FFFFFF"/>
+                <w:sz w:val="17"/>
+              </w:rPr>
+              <w:t>Garantie</w:t>
+            </w:r>
+            <w:proofErr w:type="spellEnd"/>
           </w:p>
         </w:tc>
       </w:tr>
@@ -4744,13 +5314,41 @@
             <w:pPr>
               <w:spacing w:after="0"/>
             </w:pPr>
+            <w:proofErr w:type="spellStart"/>
             <w:r>
               <w:rPr>
                 <w:b/>
                 <w:color w:val="E11D48"/>
                 <w:sz w:val="17"/>
               </w:rPr>
-              <w:t>Priorité 1 (Bloquant)</w:t>
+              <w:t>Priorité</w:t>
+            </w:r>
+            <w:proofErr w:type="spellEnd"/>
+            <w:r>
+              <w:rPr>
+                <w:b/>
+                <w:color w:val="E11D48"/>
+                <w:sz w:val="17"/>
+              </w:rPr>
+              <w:t xml:space="preserve"> 1 (</w:t>
+            </w:r>
+            <w:proofErr w:type="spellStart"/>
+            <w:r>
+              <w:rPr>
+                <w:b/>
+                <w:color w:val="E11D48"/>
+                <w:sz w:val="17"/>
+              </w:rPr>
+              <w:t>Bloquant</w:t>
+            </w:r>
+            <w:proofErr w:type="spellEnd"/>
+            <w:r>
+              <w:rPr>
+                <w:b/>
+                <w:color w:val="E11D48"/>
+                <w:sz w:val="17"/>
+              </w:rPr>
+              <w:t>)</w:t>
             </w:r>
           </w:p>
         </w:tc>
@@ -4853,14 +5451,34 @@
             <w:pPr>
               <w:spacing w:after="0"/>
             </w:pPr>
+            <w:proofErr w:type="spellStart"/>
             <w:r>
               <w:rPr>
                 <w:b/>
                 <w:color w:val="E11D48"/>
                 <w:sz w:val="17"/>
               </w:rPr>
-              <w:t>Moins de 4 heures</w:t>
-            </w:r>
+              <w:t>Moins</w:t>
+            </w:r>
+            <w:proofErr w:type="spellEnd"/>
+            <w:r>
+              <w:rPr>
+                <w:b/>
+                <w:color w:val="E11D48"/>
+                <w:sz w:val="17"/>
+              </w:rPr>
+              <w:t xml:space="preserve"> de 4 </w:t>
+            </w:r>
+            <w:proofErr w:type="spellStart"/>
+            <w:r>
+              <w:rPr>
+                <w:b/>
+                <w:color w:val="E11D48"/>
+                <w:sz w:val="17"/>
+              </w:rPr>
+              <w:t>heures</w:t>
+            </w:r>
+            <w:proofErr w:type="spellEnd"/>
           </w:p>
         </w:tc>
       </w:tr>
@@ -4889,13 +5507,41 @@
             <w:pPr>
               <w:spacing w:after="0"/>
             </w:pPr>
+            <w:proofErr w:type="spellStart"/>
             <w:r>
               <w:rPr>
                 <w:b/>
                 <w:color w:val="D97706"/>
                 <w:sz w:val="17"/>
               </w:rPr>
-              <w:t>Priorité 2 (Majeur)</w:t>
+              <w:t>Priorité</w:t>
+            </w:r>
+            <w:proofErr w:type="spellEnd"/>
+            <w:r>
+              <w:rPr>
+                <w:b/>
+                <w:color w:val="D97706"/>
+                <w:sz w:val="17"/>
+              </w:rPr>
+              <w:t xml:space="preserve"> 2 (</w:t>
+            </w:r>
+            <w:proofErr w:type="spellStart"/>
+            <w:r>
+              <w:rPr>
+                <w:b/>
+                <w:color w:val="D97706"/>
+                <w:sz w:val="17"/>
+              </w:rPr>
+              <w:t>Majeur</w:t>
+            </w:r>
+            <w:proofErr w:type="spellEnd"/>
+            <w:r>
+              <w:rPr>
+                <w:b/>
+                <w:color w:val="D97706"/>
+                <w:sz w:val="17"/>
+              </w:rPr>
+              <w:t>)</w:t>
             </w:r>
           </w:p>
         </w:tc>
@@ -4998,14 +5644,34 @@
             <w:pPr>
               <w:spacing w:after="0"/>
             </w:pPr>
+            <w:proofErr w:type="spellStart"/>
             <w:r>
               <w:rPr>
                 <w:b/>
                 <w:color w:val="E11D48"/>
                 <w:sz w:val="17"/>
               </w:rPr>
-              <w:t>Moins de 24 heures</w:t>
-            </w:r>
+              <w:t>Moins</w:t>
+            </w:r>
+            <w:proofErr w:type="spellEnd"/>
+            <w:r>
+              <w:rPr>
+                <w:b/>
+                <w:color w:val="E11D48"/>
+                <w:sz w:val="17"/>
+              </w:rPr>
+              <w:t xml:space="preserve"> de 24 </w:t>
+            </w:r>
+            <w:proofErr w:type="spellStart"/>
+            <w:r>
+              <w:rPr>
+                <w:b/>
+                <w:color w:val="E11D48"/>
+                <w:sz w:val="17"/>
+              </w:rPr>
+              <w:t>heures</w:t>
+            </w:r>
+            <w:proofErr w:type="spellEnd"/>
           </w:p>
         </w:tc>
       </w:tr>
@@ -5034,13 +5700,41 @@
             <w:pPr>
               <w:spacing w:after="0"/>
             </w:pPr>
+            <w:proofErr w:type="spellStart"/>
             <w:r>
               <w:rPr>
                 <w:b/>
                 <w:color w:val="0284C7"/>
                 <w:sz w:val="17"/>
               </w:rPr>
-              <w:t>Priorité 3 (Mineur)</w:t>
+              <w:t>Priorité</w:t>
+            </w:r>
+            <w:proofErr w:type="spellEnd"/>
+            <w:r>
+              <w:rPr>
+                <w:b/>
+                <w:color w:val="0284C7"/>
+                <w:sz w:val="17"/>
+              </w:rPr>
+              <w:t xml:space="preserve"> 3 (</w:t>
+            </w:r>
+            <w:proofErr w:type="spellStart"/>
+            <w:r>
+              <w:rPr>
+                <w:b/>
+                <w:color w:val="0284C7"/>
+                <w:sz w:val="17"/>
+              </w:rPr>
+              <w:t>Mineur</w:t>
+            </w:r>
+            <w:proofErr w:type="spellEnd"/>
+            <w:r>
+              <w:rPr>
+                <w:b/>
+                <w:color w:val="0284C7"/>
+                <w:sz w:val="17"/>
+              </w:rPr>
+              <w:t>)</w:t>
             </w:r>
           </w:p>
         </w:tc>
@@ -5143,14 +5837,34 @@
             <w:pPr>
               <w:spacing w:after="0"/>
             </w:pPr>
+            <w:proofErr w:type="spellStart"/>
             <w:r>
               <w:rPr>
                 <w:b/>
                 <w:color w:val="0284C7"/>
                 <w:sz w:val="17"/>
               </w:rPr>
-              <w:t>Moins de 72 heures</w:t>
-            </w:r>
+              <w:t>Moins</w:t>
+            </w:r>
+            <w:proofErr w:type="spellEnd"/>
+            <w:r>
+              <w:rPr>
+                <w:b/>
+                <w:color w:val="0284C7"/>
+                <w:sz w:val="17"/>
+              </w:rPr>
+              <w:t xml:space="preserve"> de 72 </w:t>
+            </w:r>
+            <w:proofErr w:type="spellStart"/>
+            <w:r>
+              <w:rPr>
+                <w:b/>
+                <w:color w:val="0284C7"/>
+                <w:sz w:val="17"/>
+              </w:rPr>
+              <w:t>heures</w:t>
+            </w:r>
+            <w:proofErr w:type="spellEnd"/>
           </w:p>
         </w:tc>
       </w:tr>
@@ -5429,7 +6143,7 @@
                 </mc:Choice>
                 <mc:Fallback>
                   <w:pict>
-                    <v:roundrect w14:anchorId="47C5E46F" id="Rectangle : coins arrondis 2" o:spid="_x0000_s1026" style="position:absolute;margin-left:1.9pt;margin-top:28.75pt;width:15.9pt;height:11.7pt;z-index:251657728;visibility:visible;mso-wrap-style:square;mso-width-percent:0;mso-height-percent:0;mso-wrap-distance-left:9pt;mso-wrap-distance-top:0;mso-wrap-distance-right:9pt;mso-wrap-distance-bottom:0;mso-position-horizontal:absolute;mso-position-horizontal-relative:text;mso-position-vertical:absolute;mso-position-vertical-relative:text;mso-width-percent:0;mso-height-percent:0;mso-width-relative:margin;mso-height-relative:margin;v-text-anchor:middle" arcsize="10923f" o:gfxdata="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" filled="f" strokecolor="#272727 [2749]" strokeweight="1pt">
+                    <v:roundrect w14:anchorId="109E46D3" id="Rectangle : coins arrondis 2" o:spid="_x0000_s1026" style="position:absolute;margin-left:1.9pt;margin-top:28.75pt;width:15.9pt;height:11.7pt;z-index:251657728;visibility:visible;mso-wrap-style:square;mso-width-percent:0;mso-height-percent:0;mso-wrap-distance-left:9pt;mso-wrap-distance-top:0;mso-wrap-distance-right:9pt;mso-wrap-distance-bottom:0;mso-position-horizontal:absolute;mso-position-horizontal-relative:text;mso-position-vertical:absolute;mso-position-vertical-relative:text;mso-width-percent:0;mso-height-percent:0;mso-width-relative:margin;mso-height-relative:margin;v-text-anchor:middle" arcsize="10923f" o:gfxdata="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" filled="f" strokecolor="#272727 [2749]" strokeweight="1pt">
                       <v:shadow on="t" color="black" opacity="22937f" origin=",.5" offset="0,.63889mm"/>
                       <w10:wrap type="square"/>
                     </v:roundrect>
@@ -5589,7 +6303,7 @@
                 </mc:Choice>
                 <mc:Fallback>
                   <w:pict>
-                    <v:roundrect w14:anchorId="0CFC0EDA" id="Rectangle : coins arrondis 3" o:spid="_x0000_s1026" style="position:absolute;margin-left:2.5pt;margin-top:2.25pt;width:16.5pt;height:10.5pt;z-index:251660800;visibility:visible;mso-wrap-style:square;mso-width-percent:0;mso-height-percent:0;mso-wrap-distance-left:9pt;mso-wrap-distance-top:0;mso-wrap-distance-right:9pt;mso-wrap-distance-bottom:0;mso-position-horizontal:absolute;mso-position-horizontal-relative:text;mso-position-vertical:absolute;mso-position-vertical-relative:text;mso-width-percent:0;mso-height-percent:0;mso-width-relative:margin;mso-height-relative:margin;v-text-anchor:middle" arcsize="10923f" o:gfxdata="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" filled="f" strokecolor="#272727 [2749]" strokeweight="1pt">
+                    <v:roundrect w14:anchorId="16407296" id="Rectangle : coins arrondis 3" o:spid="_x0000_s1026" style="position:absolute;margin-left:2.5pt;margin-top:2.25pt;width:16.5pt;height:10.5pt;z-index:251660800;visibility:visible;mso-wrap-style:square;mso-width-percent:0;mso-height-percent:0;mso-wrap-distance-left:9pt;mso-wrap-distance-top:0;mso-wrap-distance-right:9pt;mso-wrap-distance-bottom:0;mso-position-horizontal:absolute;mso-position-horizontal-relative:text;mso-position-vertical:absolute;mso-position-vertical-relative:text;mso-width-percent:0;mso-height-percent:0;mso-width-relative:margin;mso-height-relative:margin;v-text-anchor:middle" arcsize="10923f" o:gfxdata="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" filled="f" strokecolor="#272727 [2749]" strokeweight="1pt">
                       <v:shadow on="t" color="black" opacity="22937f" origin=",.5" offset="0,.63889mm"/>
                       <w10:wrap type="square"/>
                     </v:roundrect>
@@ -5611,7 +6325,7 @@
                 <w:color w:val="0F172A"/>
                 <w:lang w:val="fr-FR"/>
               </w:rPr>
-              <w:t>1</w:t>
+              <w:t>0</w:t>
             </w:r>
             <w:r>
               <w:rPr>

</xml_diff>